<commit_message>
refactor(docs): add page breaks to class diagram descriptions
- Inserted `<div style="page-break-before: always;">` to improve document readability for PDF exports.
- Updated architecture documentation to ensure diagram sections start on new pages.
- Minor style and formatting adjustments for consistency.

Signed-off-by: SatoryKono <821311@gmail.com>
</commit_message>
<xml_diff>
--- a/docs/02-architecture/mmd-diagrams/class-diagrams-with-descriptions.docx
+++ b/docs/02-architecture/mmd-diagrams/class-diagrams-with-descriptions.docx
@@ -27,7 +27,12 @@
         <w:t xml:space="preserve">Всего диаграмм: 19</w:t>
       </w:r>
     </w:p>
-    <w:bookmarkStart w:id="13" w:name="X234d485aa72ce766cf2a03088e9cecf544679a5"/>
+    <w:p>
+      <w:r>
+        <w:br w:type="page"/>
+      </w:r>
+    </w:p>
+    <w:bookmarkStart w:id="13" w:name="domain-ports-domain-port-protocols"/>
     <w:p>
       <w:pPr>
         <w:pStyle w:val="Heading2"/>
@@ -38,7 +43,7 @@
     </w:p>
     <w:p>
       <w:pPr>
-        <w:pStyle w:val="FirstParagraph"/>
+        <w:pStyle w:val="CaptionedFigure"/>
       </w:pPr>
       <w:r>
         <w:drawing>
@@ -83,6 +88,14 @@
         </w:drawing>
       </w:r>
     </w:p>
+    <w:p>
+      <w:pPr>
+        <w:pStyle w:val="ImageCaption"/>
+      </w:pPr>
+      <w:r>
+        <w:t xml:space="preserve">01-domain-ports</w:t>
+      </w:r>
+    </w:p>
     <w:bookmarkStart w:id="12" w:name="описание"/>
     <w:p>
       <w:pPr>
@@ -129,14 +142,12 @@
     </w:p>
     <w:p>
       <w:r>
-        <w:pict>
-          <v:rect style="width:0;height:1.5pt" o:hralign="center" o:hrstd="t" o:hr="t"/>
-        </w:pict>
+        <w:br w:type="page"/>
       </w:r>
     </w:p>
     <w:bookmarkEnd w:id="12"/>
     <w:bookmarkEnd w:id="13"/>
-    <w:bookmarkStart w:id="18" w:name="X711a635ebd8e748a75ee839b908c3c0fa34ec96"/>
+    <w:bookmarkStart w:id="18" w:name="Xe6ad1e6f990981ec43d97cf2a27dccc3e83fb9a"/>
     <w:p>
       <w:pPr>
         <w:pStyle w:val="Heading2"/>
@@ -147,7 +158,7 @@
     </w:p>
     <w:p>
       <w:pPr>
-        <w:pStyle w:val="FirstParagraph"/>
+        <w:pStyle w:val="CaptionedFigure"/>
       </w:pPr>
       <w:r>
         <w:drawing>
@@ -192,6 +203,14 @@
         </w:drawing>
       </w:r>
     </w:p>
+    <w:p>
+      <w:pPr>
+        <w:pStyle w:val="ImageCaption"/>
+      </w:pPr>
+      <w:r>
+        <w:t xml:space="preserve">01a-domain-ports-method-catalog</w:t>
+      </w:r>
+    </w:p>
     <w:bookmarkStart w:id="17" w:name="описание-1"/>
     <w:p>
       <w:pPr>
@@ -238,14 +257,12 @@
     </w:p>
     <w:p>
       <w:r>
-        <w:pict>
-          <v:rect style="width:0;height:1.5pt" o:hralign="center" o:hrstd="t" o:hr="t"/>
-        </w:pict>
+        <w:br w:type="page"/>
       </w:r>
     </w:p>
     <w:bookmarkEnd w:id="17"/>
     <w:bookmarkEnd w:id="18"/>
-    <w:bookmarkStart w:id="23" w:name="X9ee4458dcaeac17cd65b1492ffc530cc1a5cd94"/>
+    <w:bookmarkStart w:id="23" w:name="entities-aggregates-entities-aggregates"/>
     <w:p>
       <w:pPr>
         <w:pStyle w:val="Heading2"/>
@@ -256,7 +273,7 @@
     </w:p>
     <w:p>
       <w:pPr>
-        <w:pStyle w:val="FirstParagraph"/>
+        <w:pStyle w:val="CaptionedFigure"/>
       </w:pPr>
       <w:r>
         <w:drawing>
@@ -301,6 +318,14 @@
         </w:drawing>
       </w:r>
     </w:p>
+    <w:p>
+      <w:pPr>
+        <w:pStyle w:val="ImageCaption"/>
+      </w:pPr>
+      <w:r>
+        <w:t xml:space="preserve">02-entities-aggregates</w:t>
+      </w:r>
+    </w:p>
     <w:bookmarkStart w:id="22" w:name="описание-2"/>
     <w:p>
       <w:pPr>
@@ -347,14 +372,12 @@
     </w:p>
     <w:p>
       <w:r>
-        <w:pict>
-          <v:rect style="width:0;height:1.5pt" o:hralign="center" o:hrstd="t" o:hr="t"/>
-        </w:pict>
+        <w:br w:type="page"/>
       </w:r>
     </w:p>
     <w:bookmarkEnd w:id="22"/>
     <w:bookmarkEnd w:id="23"/>
-    <w:bookmarkStart w:id="28" w:name="X84a54ccafadf1946d71ae729472cf8301419921"/>
+    <w:bookmarkStart w:id="28" w:name="value-objects-value-objects"/>
     <w:p>
       <w:pPr>
         <w:pStyle w:val="Heading2"/>
@@ -365,7 +388,7 @@
     </w:p>
     <w:p>
       <w:pPr>
-        <w:pStyle w:val="FirstParagraph"/>
+        <w:pStyle w:val="CaptionedFigure"/>
       </w:pPr>
       <w:r>
         <w:drawing>
@@ -410,6 +433,14 @@
         </w:drawing>
       </w:r>
     </w:p>
+    <w:p>
+      <w:pPr>
+        <w:pStyle w:val="ImageCaption"/>
+      </w:pPr>
+      <w:r>
+        <w:t xml:space="preserve">03-value-objects</w:t>
+      </w:r>
+    </w:p>
     <w:bookmarkStart w:id="27" w:name="описание-3"/>
     <w:p>
       <w:pPr>
@@ -456,14 +487,12 @@
     </w:p>
     <w:p>
       <w:r>
-        <w:pict>
-          <v:rect style="width:0;height:1.5pt" o:hralign="center" o:hrstd="t" o:hr="t"/>
-        </w:pict>
+        <w:br w:type="page"/>
       </w:r>
     </w:p>
     <w:bookmarkEnd w:id="27"/>
     <w:bookmarkEnd w:id="28"/>
-    <w:bookmarkStart w:id="33" w:name="Xace7d5a93ec405001beb1636912dac960046dc9"/>
+    <w:bookmarkStart w:id="33" w:name="types-enums-types-enums"/>
     <w:p>
       <w:pPr>
         <w:pStyle w:val="Heading2"/>
@@ -474,7 +503,7 @@
     </w:p>
     <w:p>
       <w:pPr>
-        <w:pStyle w:val="FirstParagraph"/>
+        <w:pStyle w:val="CaptionedFigure"/>
       </w:pPr>
       <w:r>
         <w:drawing>
@@ -519,6 +548,14 @@
         </w:drawing>
       </w:r>
     </w:p>
+    <w:p>
+      <w:pPr>
+        <w:pStyle w:val="ImageCaption"/>
+      </w:pPr>
+      <w:r>
+        <w:t xml:space="preserve">04-types-enums</w:t>
+      </w:r>
+    </w:p>
     <w:bookmarkStart w:id="32" w:name="описание-4"/>
     <w:p>
       <w:pPr>
@@ -565,14 +602,12 @@
     </w:p>
     <w:p>
       <w:r>
-        <w:pict>
-          <v:rect style="width:0;height:1.5pt" o:hralign="center" o:hrstd="t" o:hr="t"/>
-        </w:pict>
+        <w:br w:type="page"/>
       </w:r>
     </w:p>
     <w:bookmarkEnd w:id="32"/>
     <w:bookmarkEnd w:id="33"/>
-    <w:bookmarkStart w:id="38" w:name="X0e6569730036163fe64b57caf880bb3b328f812"/>
+    <w:bookmarkStart w:id="38" w:name="exceptions-exception-hierarchy"/>
     <w:p>
       <w:pPr>
         <w:pStyle w:val="Heading2"/>
@@ -583,7 +618,7 @@
     </w:p>
     <w:p>
       <w:pPr>
-        <w:pStyle w:val="FirstParagraph"/>
+        <w:pStyle w:val="CaptionedFigure"/>
       </w:pPr>
       <w:r>
         <w:drawing>
@@ -628,6 +663,14 @@
         </w:drawing>
       </w:r>
     </w:p>
+    <w:p>
+      <w:pPr>
+        <w:pStyle w:val="ImageCaption"/>
+      </w:pPr>
+      <w:r>
+        <w:t xml:space="preserve">05-exceptions</w:t>
+      </w:r>
+    </w:p>
     <w:bookmarkStart w:id="37" w:name="описание-5"/>
     <w:p>
       <w:pPr>
@@ -674,14 +717,12 @@
     </w:p>
     <w:p>
       <w:r>
-        <w:pict>
-          <v:rect style="width:0;height:1.5pt" o:hralign="center" o:hrstd="t" o:hr="t"/>
-        </w:pict>
+        <w:br w:type="page"/>
       </w:r>
     </w:p>
     <w:bookmarkEnd w:id="37"/>
     <w:bookmarkEnd w:id="38"/>
-    <w:bookmarkStart w:id="43" w:name="X23da77654d03a8064be58b5de7d820e88496470"/>
+    <w:bookmarkStart w:id="43" w:name="config-classes-configuration-classes"/>
     <w:p>
       <w:pPr>
         <w:pStyle w:val="Heading2"/>
@@ -692,7 +733,7 @@
     </w:p>
     <w:p>
       <w:pPr>
-        <w:pStyle w:val="FirstParagraph"/>
+        <w:pStyle w:val="CaptionedFigure"/>
       </w:pPr>
       <w:r>
         <w:drawing>
@@ -737,6 +778,14 @@
         </w:drawing>
       </w:r>
     </w:p>
+    <w:p>
+      <w:pPr>
+        <w:pStyle w:val="ImageCaption"/>
+      </w:pPr>
+      <w:r>
+        <w:t xml:space="preserve">06-config-classes</w:t>
+      </w:r>
+    </w:p>
     <w:bookmarkStart w:id="42" w:name="описание-6"/>
     <w:p>
       <w:pPr>
@@ -783,14 +832,12 @@
     </w:p>
     <w:p>
       <w:r>
-        <w:pict>
-          <v:rect style="width:0;height:1.5pt" o:hralign="center" o:hrstd="t" o:hr="t"/>
-        </w:pict>
+        <w:br w:type="page"/>
       </w:r>
     </w:p>
     <w:bookmarkEnd w:id="42"/>
     <w:bookmarkEnd w:id="43"/>
-    <w:bookmarkStart w:id="48" w:name="X839fed3c3cacccb88e6202a1cf113aac14cea53"/>
+    <w:bookmarkStart w:id="48" w:name="X74ae4ac18e992bf683ceaac797f636aeb839ea7"/>
     <w:p>
       <w:pPr>
         <w:pStyle w:val="Heading2"/>
@@ -801,7 +848,7 @@
     </w:p>
     <w:p>
       <w:pPr>
-        <w:pStyle w:val="FirstParagraph"/>
+        <w:pStyle w:val="CaptionedFigure"/>
       </w:pPr>
       <w:r>
         <w:drawing>
@@ -846,6 +893,14 @@
         </w:drawing>
       </w:r>
     </w:p>
+    <w:p>
+      <w:pPr>
+        <w:pStyle w:val="ImageCaption"/>
+      </w:pPr>
+      <w:r>
+        <w:t xml:space="preserve">07-application-core-services</w:t>
+      </w:r>
+    </w:p>
     <w:bookmarkStart w:id="47" w:name="описание-7"/>
     <w:p>
       <w:pPr>
@@ -892,14 +947,12 @@
     </w:p>
     <w:p>
       <w:r>
-        <w:pict>
-          <v:rect style="width:0;height:1.5pt" o:hralign="center" o:hrstd="t" o:hr="t"/>
-        </w:pict>
+        <w:br w:type="page"/>
       </w:r>
     </w:p>
     <w:bookmarkEnd w:id="47"/>
     <w:bookmarkEnd w:id="48"/>
-    <w:bookmarkStart w:id="53" w:name="X82a8c73213d2684221accefc8899d4f88ece396"/>
+    <w:bookmarkStart w:id="53" w:name="X256f2144686f049b87a30356a91871521f2a521"/>
     <w:p>
       <w:pPr>
         <w:pStyle w:val="Heading2"/>
@@ -910,7 +963,7 @@
     </w:p>
     <w:p>
       <w:pPr>
-        <w:pStyle w:val="FirstParagraph"/>
+        <w:pStyle w:val="CaptionedFigure"/>
       </w:pPr>
       <w:r>
         <w:drawing>
@@ -955,6 +1008,14 @@
         </w:drawing>
       </w:r>
     </w:p>
+    <w:p>
+      <w:pPr>
+        <w:pStyle w:val="ImageCaption"/>
+      </w:pPr>
+      <w:r>
+        <w:t xml:space="preserve">08-application-services</w:t>
+      </w:r>
+    </w:p>
     <w:bookmarkStart w:id="52" w:name="описание-8"/>
     <w:p>
       <w:pPr>
@@ -1001,14 +1062,12 @@
     </w:p>
     <w:p>
       <w:r>
-        <w:pict>
-          <v:rect style="width:0;height:1.5pt" o:hralign="center" o:hrstd="t" o:hr="t"/>
-        </w:pict>
+        <w:br w:type="page"/>
       </w:r>
     </w:p>
     <w:bookmarkEnd w:id="52"/>
     <w:bookmarkEnd w:id="53"/>
-    <w:bookmarkStart w:id="58" w:name="X636822adf464855a6ec03f5226cd597ddbf0895"/>
+    <w:bookmarkStart w:id="58" w:name="Xba66aacd9c54541be7a911fdfea2d3633c1f203"/>
     <w:p>
       <w:pPr>
         <w:pStyle w:val="Heading2"/>
@@ -1019,7 +1078,7 @@
     </w:p>
     <w:p>
       <w:pPr>
-        <w:pStyle w:val="FirstParagraph"/>
+        <w:pStyle w:val="CaptionedFigure"/>
       </w:pPr>
       <w:r>
         <w:drawing>
@@ -1064,6 +1123,14 @@
         </w:drawing>
       </w:r>
     </w:p>
+    <w:p>
+      <w:pPr>
+        <w:pStyle w:val="ImageCaption"/>
+      </w:pPr>
+      <w:r>
+        <w:t xml:space="preserve">08a-application-services-operation-catalog</w:t>
+      </w:r>
+    </w:p>
     <w:bookmarkStart w:id="57" w:name="описание-9"/>
     <w:p>
       <w:pPr>
@@ -1110,14 +1177,12 @@
     </w:p>
     <w:p>
       <w:r>
-        <w:pict>
-          <v:rect style="width:0;height:1.5pt" o:hralign="center" o:hrstd="t" o:hr="t"/>
-        </w:pict>
+        <w:br w:type="page"/>
       </w:r>
     </w:p>
     <w:bookmarkEnd w:id="57"/>
     <w:bookmarkEnd w:id="58"/>
-    <w:bookmarkStart w:id="63" w:name="Xf8df1eb51060347c646fb53a465bec2d7dbaad3"/>
+    <w:bookmarkStart w:id="63" w:name="transformers-transformers"/>
     <w:p>
       <w:pPr>
         <w:pStyle w:val="Heading2"/>
@@ -1128,7 +1193,7 @@
     </w:p>
     <w:p>
       <w:pPr>
-        <w:pStyle w:val="FirstParagraph"/>
+        <w:pStyle w:val="CaptionedFigure"/>
       </w:pPr>
       <w:r>
         <w:drawing>
@@ -1173,6 +1238,14 @@
         </w:drawing>
       </w:r>
     </w:p>
+    <w:p>
+      <w:pPr>
+        <w:pStyle w:val="ImageCaption"/>
+      </w:pPr>
+      <w:r>
+        <w:t xml:space="preserve">09-transformers</w:t>
+      </w:r>
+    </w:p>
     <w:bookmarkStart w:id="62" w:name="описание-10"/>
     <w:p>
       <w:pPr>
@@ -1219,14 +1292,12 @@
     </w:p>
     <w:p>
       <w:r>
-        <w:pict>
-          <v:rect style="width:0;height:1.5pt" o:hralign="center" o:hrstd="t" o:hr="t"/>
-        </w:pict>
+        <w:br w:type="page"/>
       </w:r>
     </w:p>
     <w:bookmarkEnd w:id="62"/>
     <w:bookmarkEnd w:id="63"/>
-    <w:bookmarkStart w:id="68" w:name="X96d3b2cbe409b8b0ede3f2e7552ba9647a8e3fe"/>
+    <w:bookmarkStart w:id="68" w:name="adapters-infrastructure-adapters"/>
     <w:p>
       <w:pPr>
         <w:pStyle w:val="Heading2"/>
@@ -1237,7 +1308,7 @@
     </w:p>
     <w:p>
       <w:pPr>
-        <w:pStyle w:val="FirstParagraph"/>
+        <w:pStyle w:val="CaptionedFigure"/>
       </w:pPr>
       <w:r>
         <w:drawing>
@@ -1282,6 +1353,14 @@
         </w:drawing>
       </w:r>
     </w:p>
+    <w:p>
+      <w:pPr>
+        <w:pStyle w:val="ImageCaption"/>
+      </w:pPr>
+      <w:r>
+        <w:t xml:space="preserve">10-adapters</w:t>
+      </w:r>
+    </w:p>
     <w:bookmarkStart w:id="67" w:name="описание-11"/>
     <w:p>
       <w:pPr>
@@ -1328,14 +1407,12 @@
     </w:p>
     <w:p>
       <w:r>
-        <w:pict>
-          <v:rect style="width:0;height:1.5pt" o:hralign="center" o:hrstd="t" o:hr="t"/>
-        </w:pict>
+        <w:br w:type="page"/>
       </w:r>
     </w:p>
     <w:bookmarkEnd w:id="67"/>
     <w:bookmarkEnd w:id="68"/>
-    <w:bookmarkStart w:id="73" w:name="Xa548d707fc9e3e6e4e4cf6ce801efcfcacd2cf1"/>
+    <w:bookmarkStart w:id="73" w:name="storage-storage-components"/>
     <w:p>
       <w:pPr>
         <w:pStyle w:val="Heading2"/>
@@ -1346,7 +1423,7 @@
     </w:p>
     <w:p>
       <w:pPr>
-        <w:pStyle w:val="FirstParagraph"/>
+        <w:pStyle w:val="CaptionedFigure"/>
       </w:pPr>
       <w:r>
         <w:drawing>
@@ -1391,6 +1468,14 @@
         </w:drawing>
       </w:r>
     </w:p>
+    <w:p>
+      <w:pPr>
+        <w:pStyle w:val="ImageCaption"/>
+      </w:pPr>
+      <w:r>
+        <w:t xml:space="preserve">11-storage</w:t>
+      </w:r>
+    </w:p>
     <w:bookmarkStart w:id="72" w:name="описание-12"/>
     <w:p>
       <w:pPr>
@@ -1437,14 +1522,12 @@
     </w:p>
     <w:p>
       <w:r>
-        <w:pict>
-          <v:rect style="width:0;height:1.5pt" o:hralign="center" o:hrstd="t" o:hr="t"/>
-        </w:pict>
+        <w:br w:type="page"/>
       </w:r>
     </w:p>
     <w:bookmarkEnd w:id="72"/>
     <w:bookmarkEnd w:id="73"/>
-    <w:bookmarkStart w:id="78" w:name="X2b8b46128bd73996913fd0956f6425cc022bb3f"/>
+    <w:bookmarkStart w:id="78" w:name="Xd3476fee4348dcc1c6f2d9f59b955b67d61b150"/>
     <w:p>
       <w:pPr>
         <w:pStyle w:val="Heading2"/>
@@ -1455,7 +1538,7 @@
     </w:p>
     <w:p>
       <w:pPr>
-        <w:pStyle w:val="FirstParagraph"/>
+        <w:pStyle w:val="CaptionedFigure"/>
       </w:pPr>
       <w:r>
         <w:drawing>
@@ -1500,6 +1583,14 @@
         </w:drawing>
       </w:r>
     </w:p>
+    <w:p>
+      <w:pPr>
+        <w:pStyle w:val="ImageCaption"/>
+      </w:pPr>
+      <w:r>
+        <w:t xml:space="preserve">12-composite-pipeline</w:t>
+      </w:r>
+    </w:p>
     <w:bookmarkStart w:id="77" w:name="описание-13"/>
     <w:p>
       <w:pPr>
@@ -1546,14 +1637,12 @@
     </w:p>
     <w:p>
       <w:r>
-        <w:pict>
-          <v:rect style="width:0;height:1.5pt" o:hralign="center" o:hrstd="t" o:hr="t"/>
-        </w:pict>
+        <w:br w:type="page"/>
       </w:r>
     </w:p>
     <w:bookmarkEnd w:id="77"/>
     <w:bookmarkEnd w:id="78"/>
-    <w:bookmarkStart w:id="83" w:name="X82f59d8782455524808080e9389287f087250f1"/>
+    <w:bookmarkStart w:id="83" w:name="domain-services-domain-services"/>
     <w:p>
       <w:pPr>
         <w:pStyle w:val="Heading2"/>
@@ -1564,7 +1653,7 @@
     </w:p>
     <w:p>
       <w:pPr>
-        <w:pStyle w:val="FirstParagraph"/>
+        <w:pStyle w:val="CaptionedFigure"/>
       </w:pPr>
       <w:r>
         <w:drawing>
@@ -1609,6 +1698,14 @@
         </w:drawing>
       </w:r>
     </w:p>
+    <w:p>
+      <w:pPr>
+        <w:pStyle w:val="ImageCaption"/>
+      </w:pPr>
+      <w:r>
+        <w:t xml:space="preserve">13-domain-services</w:t>
+      </w:r>
+    </w:p>
     <w:bookmarkStart w:id="82" w:name="описание-14"/>
     <w:p>
       <w:pPr>
@@ -1655,14 +1752,12 @@
     </w:p>
     <w:p>
       <w:r>
-        <w:pict>
-          <v:rect style="width:0;height:1.5pt" o:hralign="center" o:hrstd="t" o:hr="t"/>
-        </w:pict>
+        <w:br w:type="page"/>
       </w:r>
     </w:p>
     <w:bookmarkEnd w:id="82"/>
     <w:bookmarkEnd w:id="83"/>
-    <w:bookmarkStart w:id="88" w:name="Xd7dc352a4d06c6321a52650a8db1912db7162cf"/>
+    <w:bookmarkStart w:id="88" w:name="observability-observability-components"/>
     <w:p>
       <w:pPr>
         <w:pStyle w:val="Heading2"/>
@@ -1673,7 +1768,7 @@
     </w:p>
     <w:p>
       <w:pPr>
-        <w:pStyle w:val="FirstParagraph"/>
+        <w:pStyle w:val="CaptionedFigure"/>
       </w:pPr>
       <w:r>
         <w:drawing>
@@ -1718,6 +1813,14 @@
         </w:drawing>
       </w:r>
     </w:p>
+    <w:p>
+      <w:pPr>
+        <w:pStyle w:val="ImageCaption"/>
+      </w:pPr>
+      <w:r>
+        <w:t xml:space="preserve">14-observability</w:t>
+      </w:r>
+    </w:p>
     <w:bookmarkStart w:id="87" w:name="описание-15"/>
     <w:p>
       <w:pPr>
@@ -1764,14 +1867,12 @@
     </w:p>
     <w:p>
       <w:r>
-        <w:pict>
-          <v:rect style="width:0;height:1.5pt" o:hralign="center" o:hrstd="t" o:hr="t"/>
-        </w:pict>
+        <w:br w:type="page"/>
       </w:r>
     </w:p>
     <w:bookmarkEnd w:id="87"/>
     <w:bookmarkEnd w:id="88"/>
-    <w:bookmarkStart w:id="93" w:name="Xfa5955ff0c8afc2a0e63947e4544952f0f51ad6"/>
+    <w:bookmarkStart w:id="93" w:name="X049c0a9eaacd195e8496eead93a83051838c82d"/>
     <w:p>
       <w:pPr>
         <w:pStyle w:val="Heading2"/>
@@ -1782,7 +1883,7 @@
     </w:p>
     <w:p>
       <w:pPr>
-        <w:pStyle w:val="FirstParagraph"/>
+        <w:pStyle w:val="CaptionedFigure"/>
       </w:pPr>
       <w:r>
         <w:drawing>
@@ -1827,6 +1928,14 @@
         </w:drawing>
       </w:r>
     </w:p>
+    <w:p>
+      <w:pPr>
+        <w:pStyle w:val="ImageCaption"/>
+      </w:pPr>
+      <w:r>
+        <w:t xml:space="preserve">14a-observability-method-catalog</w:t>
+      </w:r>
+    </w:p>
     <w:bookmarkStart w:id="92" w:name="описание-16"/>
     <w:p>
       <w:pPr>
@@ -1873,14 +1982,12 @@
     </w:p>
     <w:p>
       <w:r>
-        <w:pict>
-          <v:rect style="width:0;height:1.5pt" o:hralign="center" o:hrstd="t" o:hr="t"/>
-        </w:pict>
+        <w:br w:type="page"/>
       </w:r>
     </w:p>
     <w:bookmarkEnd w:id="92"/>
     <w:bookmarkEnd w:id="93"/>
-    <w:bookmarkStart w:id="98" w:name="Xb68ab56c3e91a7970c76f1ab36c2b04e1db73cb"/>
+    <w:bookmarkStart w:id="98" w:name="extractors-field-extractors"/>
     <w:p>
       <w:pPr>
         <w:pStyle w:val="Heading2"/>
@@ -1891,7 +1998,7 @@
     </w:p>
     <w:p>
       <w:pPr>
-        <w:pStyle w:val="FirstParagraph"/>
+        <w:pStyle w:val="CaptionedFigure"/>
       </w:pPr>
       <w:r>
         <w:drawing>
@@ -1936,6 +2043,14 @@
         </w:drawing>
       </w:r>
     </w:p>
+    <w:p>
+      <w:pPr>
+        <w:pStyle w:val="ImageCaption"/>
+      </w:pPr>
+      <w:r>
+        <w:t xml:space="preserve">15-extractors</w:t>
+      </w:r>
+    </w:p>
     <w:bookmarkStart w:id="97" w:name="описание-17"/>
     <w:p>
       <w:pPr>
@@ -1982,14 +2097,12 @@
     </w:p>
     <w:p>
       <w:r>
-        <w:pict>
-          <v:rect style="width:0;height:1.5pt" o:hralign="center" o:hrstd="t" o:hr="t"/>
-        </w:pict>
+        <w:br w:type="page"/>
       </w:r>
     </w:p>
     <w:bookmarkEnd w:id="97"/>
     <w:bookmarkEnd w:id="98"/>
-    <w:bookmarkStart w:id="103" w:name="X1c5bae0331b261c1812555fa790998df40affbb"/>
+    <w:bookmarkStart w:id="103" w:name="factories-bootstrap-factories-bootstrap"/>
     <w:p>
       <w:pPr>
         <w:pStyle w:val="Heading2"/>
@@ -2000,7 +2113,7 @@
     </w:p>
     <w:p>
       <w:pPr>
-        <w:pStyle w:val="FirstParagraph"/>
+        <w:pStyle w:val="CaptionedFigure"/>
       </w:pPr>
       <w:r>
         <w:drawing>
@@ -2043,6 +2156,14 @@
             </a:graphic>
           </wp:inline>
         </w:drawing>
+      </w:r>
+    </w:p>
+    <w:p>
+      <w:pPr>
+        <w:pStyle w:val="ImageCaption"/>
+      </w:pPr>
+      <w:r>
+        <w:t xml:space="preserve">16-factories-bootstrap</w:t>
       </w:r>
     </w:p>
     <w:bookmarkStart w:id="102" w:name="описание-18"/>

</xml_diff>